<commit_message>
Fix ES CV: move thesis to GIS Specialization, out of Eng. degree
Trabajo de grado SAR (Sentinel-1) now listed under Especialización
(Universidad de Manizales), not under Ingeniería Ambiental.

Co-Authored-By: Claude Sonnet 4.6 <noreply@anthropic.com>
</commit_message>
<xml_diff>
--- a/CV_Fabio_Neira_ES_ATS.docx
+++ b/CV_Fabio_Neira_ES_ATS.docx
@@ -1394,21 +1394,19 @@
         <w:rPr>
           <w:color w:val="1A1A1A"/>
         </w:rPr>
-        <w:t xml:space="preserve">Énfasis en análisis espacial avanzado, automatización con Python, procesamiento de imágenes satelitales y modelación geoespacial en ArcGIS Pro, QGIS, SNAP y Google Earth </w:t>
-      </w:r>
-      <w:proofErr w:type="spellStart"/>
-      <w:r>
-        <w:rPr>
-          <w:color w:val="1A1A1A"/>
-        </w:rPr>
-        <w:t>Engine</w:t>
-      </w:r>
-      <w:proofErr w:type="spellEnd"/>
-      <w:r>
-        <w:rPr>
-          <w:color w:val="1A1A1A"/>
-        </w:rPr>
-        <w:t>.</w:t>
+        <w:t>Énfasis en análisis espacial avanzado, automatización con Python, procesamiento de imágenes satelitales y modelación geoespacial en ArcGIS Pro, QGIS, SNAP y Google Earth Engine. Trabajo de grado: aplicación de tecnología SAR (Sentinel-1) para la identificación automatizada de cuerpos de agua en zonas costeras.</w:t>
+      </w:r>
+      <w:proofErr w:type="spellStart"/>
+      <w:r>
+        <w:rPr>
+          <w:color w:val="1A1A1A"/>
+        </w:rPr>
+      </w:r>
+      <w:proofErr w:type="spellEnd"/>
+      <w:r>
+        <w:rPr>
+          <w:color w:val="1A1A1A"/>
+        </w:rPr>
       </w:r>
     </w:p>
     <w:p>
@@ -1456,22 +1454,6 @@
           <w:color w:val="1B3A6B"/>
         </w:rPr>
         <w:t>Universidad de Antioquia</w:t>
-      </w:r>
-    </w:p>
-    <w:p>
-      <w:pPr>
-        <w:pStyle w:val="Prrafodelista"/>
-        <w:numPr>
-          <w:ilvl w:val="0"/>
-          <w:numId w:val="2"/>
-        </w:numPr>
-        <w:spacing w:before="40" w:after="40"/>
-      </w:pPr>
-      <w:r>
-        <w:rPr>
-          <w:color w:val="1A1A1A"/>
-        </w:rPr>
-        <w:t>Trabajo de grado: Aplicación de tecnología SAR (Sentinel-1) para la identificación automatizada de cuerpos de agua en zonas costeras.</w:t>
       </w:r>
     </w:p>
     <w:p>

</xml_diff>